<commit_message>
update for family all
</commit_message>
<xml_diff>
--- a/resources/Nanxing_hotel.docx
+++ b/resources/Nanxing_hotel.docx
@@ -967,7 +967,7 @@
           </mc:Choice>
           <mc:Fallback>
             <w:pict>
-              <v:group w14:anchorId="0D8C44FF" id="Group 2" o:spid="_x0000_s1026" style="position:absolute;margin-left:39.35pt;margin-top:-15.25pt;width:542.25pt;height:528.4pt;z-index:-15818240;mso-wrap-distance-left:0;mso-wrap-distance-right:0;mso-position-horizontal-relative:page" coordsize="68865,67106" o:gfxdata="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">
+              <v:group w14:anchorId="4550B59B" id="Group 2" o:spid="_x0000_s1026" style="position:absolute;margin-left:39.35pt;margin-top:-15.25pt;width:542.25pt;height:528.4pt;z-index:-15818240;mso-wrap-distance-left:0;mso-wrap-distance-right:0;mso-position-horizontal-relative:page" coordsize="68865,67106" o:gfxdata="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">
                 <v:shape id="Graphic 3" o:spid="_x0000_s1027" style="position:absolute;top:6;width:68865;height:63449;visibility:visible;mso-wrap-style:square;v-text-anchor:top" coordsize="6886575,6344920" o:gfxdata="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" path="m6886575,r-9525,l6877050,6333490r-6867525,l9525,,,,,6333490r,11430l6886575,6344920r,-11430l6886575,xe" fillcolor="#3c4752" stroked="f">
                   <v:path arrowok="t"/>
                 </v:shape>
@@ -1753,28 +1753,16 @@
         <w:rPr>
           <w:spacing w:val="-2"/>
         </w:rPr>
-        <w:t>(</w:t>
+        <w:t>((</w:t>
+      </w:r>
+      <w:r>
+        <w:t>names | length</w:t>
       </w:r>
       <w:r>
         <w:rPr>
           <w:spacing w:val="-2"/>
         </w:rPr>
-        <w:t>(</w:t>
-      </w:r>
-      <w:r>
-        <w:t>names | length</w:t>
-      </w:r>
-      <w:r>
-        <w:rPr>
-          <w:spacing w:val="-2"/>
-        </w:rPr>
-        <w:t>)</w:t>
-      </w:r>
-      <w:r>
-        <w:rPr>
-          <w:spacing w:val="-2"/>
-        </w:rPr>
-        <w:t>+1) //2</w:t>
+        <w:t>)+1) //2</w:t>
       </w:r>
       <w:r>
         <w:rPr>
@@ -3344,19 +3332,19 @@
         <w:ind w:left="518"/>
       </w:pPr>
       <w:r>
-        <w:t>1</w:t>
-      </w:r>
-      <w:r>
-        <w:rPr>
-          <w:spacing w:val="-11"/>
-        </w:rPr>
-        <w:t xml:space="preserve"> </w:t>
+        <w:t xml:space="preserve">{{adults_number}} </w:t>
       </w:r>
       <w:r>
         <w:t>adults</w:t>
       </w:r>
       <w:r>
-        <w:t>, 1 child</w:t>
+        <w:t xml:space="preserve">, </w:t>
+      </w:r>
+      <w:r>
+        <w:t xml:space="preserve">{{child_number}} </w:t>
+      </w:r>
+      <w:r>
+        <w:t>child</w:t>
       </w:r>
     </w:p>
     <w:p>
@@ -5169,7 +5157,7 @@
           </mc:Choice>
           <mc:Fallback>
             <w:pict>
-              <v:shape w14:anchorId="46DB773A" id="Graphic 16" o:spid="_x0000_s1026" style="position:absolute;margin-left:35.25pt;margin-top:-10.3pt;width:542.25pt;height:.75pt;z-index:15730688;visibility:visible;mso-wrap-style:square;mso-wrap-distance-left:0;mso-wrap-distance-top:0;mso-wrap-distance-right:0;mso-wrap-distance-bottom:0;mso-position-horizontal:absolute;mso-position-horizontal-relative:page;mso-position-vertical:absolute;mso-position-vertical-relative:text;v-text-anchor:top" coordsize="6886575,9525" o:gfxdata="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" path="m6886575,l,,,9525r6886575,l6886575,xe" fillcolor="#cdcdcd" stroked="f">
+              <v:shape w14:anchorId="7714E94E" id="Graphic 16" o:spid="_x0000_s1026" style="position:absolute;margin-left:35.25pt;margin-top:-10.3pt;width:542.25pt;height:.75pt;z-index:15730688;visibility:visible;mso-wrap-style:square;mso-wrap-distance-left:0;mso-wrap-distance-top:0;mso-wrap-distance-right:0;mso-wrap-distance-bottom:0;mso-position-horizontal:absolute;mso-position-horizontal-relative:page;mso-position-vertical:absolute;mso-position-vertical-relative:text;v-text-anchor:top" coordsize="6886575,9525" o:gfxdata="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" path="m6886575,l,,,9525r6886575,l6886575,xe" fillcolor="#cdcdcd" stroked="f">
                 <v:path arrowok="t"/>
                 <w10:wrap anchorx="page"/>
               </v:shape>
@@ -5427,7 +5415,7 @@
           </mc:Choice>
           <mc:Fallback>
             <w:pict>
-              <v:shape w14:anchorId="5818037A" id="Graphic 18" o:spid="_x0000_s1026" style="position:absolute;margin-left:54.35pt;margin-top:8.4pt;width:1.8pt;height:.4pt;z-index:15730176;visibility:visible;mso-wrap-style:square;mso-wrap-distance-left:0;mso-wrap-distance-top:0;mso-wrap-distance-right:0;mso-wrap-distance-bottom:0;mso-position-horizontal:absolute;mso-position-horizontal-relative:page;mso-position-vertical:absolute;mso-position-vertical-relative:text;v-text-anchor:top" coordsize="22860,5080" o:gfxdata="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" path="m22859,l,,,4572r22859,l22859,xe" fillcolor="black" stroked="f">
+              <v:shape w14:anchorId="4C2F9DCD" id="Graphic 18" o:spid="_x0000_s1026" style="position:absolute;margin-left:54.35pt;margin-top:8.4pt;width:1.8pt;height:.4pt;z-index:15730176;visibility:visible;mso-wrap-style:square;mso-wrap-distance-left:0;mso-wrap-distance-top:0;mso-wrap-distance-right:0;mso-wrap-distance-bottom:0;mso-position-horizontal:absolute;mso-position-horizontal-relative:page;mso-position-vertical:absolute;mso-position-vertical-relative:text;v-text-anchor:top" coordsize="22860,5080" o:gfxdata="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" path="m22859,l,,,4572r22859,l22859,xe" fillcolor="black" stroked="f">
                 <v:path arrowok="t"/>
                 <w10:wrap anchorx="page"/>
               </v:shape>
@@ -6230,7 +6218,7 @@
           </mc:Choice>
           <mc:Fallback>
             <w:pict>
-              <v:shape w14:anchorId="4FC012C2" id="Graphic 19" o:spid="_x0000_s1026" style="position:absolute;margin-left:35.25pt;margin-top:23.15pt;width:542.25pt;height:.75pt;z-index:15731712;visibility:visible;mso-wrap-style:square;mso-wrap-distance-left:0;mso-wrap-distance-top:0;mso-wrap-distance-right:0;mso-wrap-distance-bottom:0;mso-position-horizontal:absolute;mso-position-horizontal-relative:page;mso-position-vertical:absolute;mso-position-vertical-relative:text;v-text-anchor:top" coordsize="6886575,9525" o:gfxdata="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" path="m6886575,l,,,9525r6886575,l6886575,xe" fillcolor="#cdcdcd" stroked="f">
+              <v:shape w14:anchorId="32D4A8FD" id="Graphic 19" o:spid="_x0000_s1026" style="position:absolute;margin-left:35.25pt;margin-top:23.15pt;width:542.25pt;height:.75pt;z-index:15731712;visibility:visible;mso-wrap-style:square;mso-wrap-distance-left:0;mso-wrap-distance-top:0;mso-wrap-distance-right:0;mso-wrap-distance-bottom:0;mso-position-horizontal:absolute;mso-position-horizontal-relative:page;mso-position-vertical:absolute;mso-position-vertical-relative:text;v-text-anchor:top" coordsize="6886575,9525" o:gfxdata="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" path="m6886575,l,,,9525r6886575,l6886575,xe" fillcolor="#cdcdcd" stroked="f">
                 <v:path arrowok="t"/>
                 <w10:wrap anchorx="page"/>
               </v:shape>
@@ -6424,7 +6412,7 @@
           </mc:Choice>
           <mc:Fallback>
             <w:pict>
-              <v:group w14:anchorId="1D8E4643" id="Group 20" o:spid="_x0000_s1026" style="width:242.25pt;height:1.5pt;mso-position-horizontal-relative:char;mso-position-vertical-relative:line" coordsize="30765,190" o:gfxdata="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">
+              <v:group w14:anchorId="0B6FDAF7" id="Group 20" o:spid="_x0000_s1026" style="width:242.25pt;height:1.5pt;mso-position-horizontal-relative:char;mso-position-vertical-relative:line" coordsize="30765,190" o:gfxdata="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">
                 <v:shape id="Graphic 21" o:spid="_x0000_s1027" style="position:absolute;top:95;width:30765;height:95;visibility:visible;mso-wrap-style:square;v-text-anchor:top" coordsize="3076575,9525" o:gfxdata="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" path="m3076575,l,,,9525r3076575,l3076575,xe" fillcolor="#e7e7e7" stroked="f">
                   <v:path arrowok="t"/>
                 </v:shape>
@@ -6996,7 +6984,7 @@
         <v:path o:extrusionok="f" gradientshapeok="t" o:connecttype="rect"/>
         <o:lock v:ext="edit" aspectratio="t"/>
       </v:shapetype>
-      <v:shape id="_x0000_i1031" type="#_x0000_t75" style="width:6.2pt;height:6.2pt" o:bullet="t">
+      <v:shape id="_x0000_i1030" type="#_x0000_t75" style="width:6pt;height:6pt" o:bullet="t">
         <v:imagedata r:id="rId1" o:title="image7"/>
       </v:shape>
     </w:pict>

</xml_diff>